<commit_message>
fixed apr 13 to apr 15 for exam 3
</commit_message>
<xml_diff>
--- a/PHYS2426/info/course-calendar.docx
+++ b/PHYS2426/info/course-calendar.docx
@@ -432,7 +432,13 @@
         <w:spacing w:after="0"/>
       </w:pPr>
       <w:r>
-        <w:t>Wed, 13 Apr 2026: EXAM 3</w:t>
+        <w:t>Wed, 1</w:t>
+      </w:r>
+      <w:r>
+        <w:t>5</w:t>
+      </w:r>
+      <w:r>
+        <w:t xml:space="preserve"> Apr 2026: EXAM 3</w:t>
       </w:r>
     </w:p>
     <w:p>

</xml_diff>